<commit_message>
Show selected engineering work and refresh resumes
</commit_message>
<xml_diff>
--- a/public/downloads/resume-en.docx
+++ b/public/downloads/resume-en.docx
@@ -8,14 +8,14 @@
         <w:keepNext/>
         <w:keepLines/>
         <w:widowControl/>
-        <w:spacing w:before="0" w:after="100" w:line="580" w:lineRule="exact"/>
+        <w:spacing w:before="0" w:after="80" w:line="620" w:lineRule="exact"/>
       </w:pPr>
       <w:r>
         <w:rPr>
-          <w:rFonts w:ascii="Arial" w:hAnsi="Arial"/>
+          <w:rFonts w:ascii="Segoe UI" w:hAnsi="Segoe UI"/>
           <w:b/>
-          <w:color w:val="000000"/>
-          <w:sz w:val="48"/>
+          <w:color w:val="292925"/>
+          <w:sz w:val="54"/>
           <w:lang w:val="en-US"/>
         </w:rPr>
         <w:t>Vladislav Kalashnikov</w:t>
@@ -26,17 +26,17 @@
         <w:keepNext/>
         <w:keepLines/>
         <w:widowControl/>
-        <w:spacing w:before="0" w:after="100" w:line="300" w:lineRule="exact"/>
+        <w:spacing w:before="0" w:after="100" w:line="320" w:lineRule="exact"/>
       </w:pPr>
       <w:r>
         <w:rPr>
-          <w:rFonts w:ascii="Arial" w:hAnsi="Arial"/>
+          <w:rFonts w:ascii="Segoe UI" w:hAnsi="Segoe UI"/>
           <w:b w:val="0"/>
-          <w:color w:val="000000"/>
+          <w:color w:val="B74B34"/>
           <w:sz w:val="24"/>
           <w:lang w:val="en-US"/>
         </w:rPr>
-        <w:t>Backend Developer - Python / TypeScript</w:t>
+        <w:t>Backend Developer</w:t>
       </w:r>
     </w:p>
     <w:p>
@@ -44,13 +44,13 @@
         <w:keepNext w:val="0"/>
         <w:keepLines/>
         <w:widowControl/>
-        <w:spacing w:before="0" w:after="60" w:line="240" w:lineRule="exact"/>
+        <w:spacing w:before="0" w:after="40" w:line="248" w:lineRule="exact"/>
       </w:pPr>
       <w:r>
         <w:rPr>
-          <w:rFonts w:ascii="Arial" w:hAnsi="Arial"/>
+          <w:rFonts w:ascii="Segoe UI" w:hAnsi="Segoe UI"/>
           <w:b w:val="0"/>
-          <w:color w:val="000000"/>
+          <w:color w:val="696A64"/>
           <w:sz w:val="18"/>
           <w:lang w:val="en-US"/>
         </w:rPr>
@@ -59,8 +59,8 @@
       <w:hyperlink r:id="rId9">
         <w:r>
           <w:rPr>
-            <w:rFonts w:ascii="Arial" w:hAnsi="Arial"/>
-            <w:color w:val="000000"/>
+            <w:rFonts w:ascii="Segoe UI" w:hAnsi="Segoe UI"/>
+            <w:color w:val="696A64"/>
             <w:sz w:val="19"/>
             <w:u w:val="single"/>
             <w:lang w:val="en-US"/>
@@ -70,9 +70,9 @@
       </w:hyperlink>
       <w:r>
         <w:rPr>
-          <w:rFonts w:ascii="Arial" w:hAnsi="Arial"/>
+          <w:rFonts w:ascii="Segoe UI" w:hAnsi="Segoe UI"/>
           <w:b w:val="0"/>
-          <w:color w:val="000000"/>
+          <w:color w:val="696A64"/>
           <w:sz w:val="18"/>
           <w:lang w:val="en-US"/>
         </w:rPr>
@@ -83,13 +83,13 @@
         <w:keepNext w:val="0"/>
         <w:keepLines/>
         <w:widowControl/>
-        <w:spacing w:before="0" w:after="60" w:line="240" w:lineRule="exact"/>
+        <w:spacing w:before="0" w:after="40" w:line="248" w:lineRule="exact"/>
       </w:pPr>
       <w:r>
         <w:rPr>
-          <w:rFonts w:ascii="Arial" w:hAnsi="Arial"/>
+          <w:rFonts w:ascii="Segoe UI" w:hAnsi="Segoe UI"/>
           <w:b w:val="0"/>
-          <w:color w:val="000000"/>
+          <w:color w:val="696A64"/>
           <w:sz w:val="18"/>
           <w:lang w:val="en-US"/>
         </w:rPr>
@@ -97,8 +97,8 @@
       <w:hyperlink r:id="rId10">
         <w:r>
           <w:rPr>
-            <w:rFonts w:ascii="Arial" w:hAnsi="Arial"/>
-            <w:color w:val="000000"/>
+            <w:rFonts w:ascii="Segoe UI" w:hAnsi="Segoe UI"/>
+            <w:color w:val="696A64"/>
             <w:sz w:val="19"/>
             <w:u w:val="single"/>
             <w:lang w:val="en-US"/>
@@ -108,9 +108,9 @@
       </w:hyperlink>
       <w:r>
         <w:rPr>
-          <w:rFonts w:ascii="Arial" w:hAnsi="Arial"/>
+          <w:rFonts w:ascii="Segoe UI" w:hAnsi="Segoe UI"/>
           <w:b w:val="0"/>
-          <w:color w:val="000000"/>
+          <w:color w:val="696A64"/>
           <w:sz w:val="18"/>
           <w:lang w:val="en-US"/>
         </w:rPr>
@@ -119,8 +119,8 @@
       <w:hyperlink r:id="rId11">
         <w:r>
           <w:rPr>
-            <w:rFonts w:ascii="Arial" w:hAnsi="Arial"/>
-            <w:color w:val="000000"/>
+            <w:rFonts w:ascii="Segoe UI" w:hAnsi="Segoe UI"/>
+            <w:color w:val="696A64"/>
             <w:sz w:val="19"/>
             <w:u w:val="single"/>
             <w:lang w:val="en-US"/>
@@ -130,9 +130,9 @@
       </w:hyperlink>
       <w:r>
         <w:rPr>
-          <w:rFonts w:ascii="Arial" w:hAnsi="Arial"/>
+          <w:rFonts w:ascii="Segoe UI" w:hAnsi="Segoe UI"/>
           <w:b w:val="0"/>
-          <w:color w:val="000000"/>
+          <w:color w:val="696A64"/>
           <w:sz w:val="18"/>
           <w:lang w:val="en-US"/>
         </w:rPr>
@@ -144,17 +144,17 @@
         <w:keepNext/>
         <w:keepLines/>
         <w:widowControl/>
-        <w:spacing w:before="260" w:after="100" w:line="280" w:lineRule="exact"/>
+        <w:spacing w:before="180" w:after="80" w:line="280" w:lineRule="exact"/>
       </w:pPr>
       <w:r>
         <w:rPr>
-          <w:rFonts w:ascii="Arial" w:hAnsi="Arial"/>
+          <w:rFonts w:ascii="Segoe UI" w:hAnsi="Segoe UI"/>
           <w:b/>
-          <w:color w:val="000000"/>
-          <w:sz w:val="22"/>
+          <w:color w:val="B74B34"/>
+          <w:sz w:val="21"/>
           <w:lang w:val="en-US"/>
         </w:rPr>
-        <w:t>About</w:t>
+        <w:t>Profile</w:t>
       </w:r>
     </w:p>
     <w:p>
@@ -162,17 +162,17 @@
         <w:keepNext w:val="0"/>
         <w:keepLines/>
         <w:widowControl/>
-        <w:spacing w:before="0" w:after="80" w:line="272" w:lineRule="exact"/>
+        <w:spacing w:before="0" w:after="40" w:line="270" w:lineRule="exact"/>
       </w:pPr>
       <w:r>
         <w:rPr>
-          <w:rFonts w:ascii="Arial" w:hAnsi="Arial"/>
+          <w:rFonts w:ascii="Segoe UI" w:hAnsi="Segoe UI"/>
           <w:b w:val="0"/>
-          <w:color w:val="000000"/>
+          <w:color w:val="292925"/>
           <w:sz w:val="20"/>
           <w:lang w:val="en-US"/>
         </w:rPr>
-        <w:t>I write backends for web applications in Python and TypeScript. I have worked on request management, service booking, document handling and Telegram bots. I design databases, build APIs and connect them to the frontend.</w:t>
+        <w:t>I build APIs and integrations for web services. My diploma project covered document uploads and access checks; for a live studio site, I built price and PDF sync with fallback when the source fails. My own tools cover event journaling and Windows diagnostics.</w:t>
       </w:r>
     </w:p>
     <w:p>
@@ -181,14 +181,359 @@
         <w:keepNext/>
         <w:keepLines/>
         <w:widowControl/>
-        <w:spacing w:before="260" w:after="100" w:line="280" w:lineRule="exact"/>
+        <w:spacing w:before="180" w:after="80" w:line="280" w:lineRule="exact"/>
       </w:pPr>
       <w:r>
         <w:rPr>
-          <w:rFonts w:ascii="Arial" w:hAnsi="Arial"/>
+          <w:rFonts w:ascii="Segoe UI" w:hAnsi="Segoe UI"/>
           <w:b/>
-          <w:color w:val="000000"/>
-          <w:sz w:val="22"/>
+          <w:color w:val="B74B34"/>
+          <w:sz w:val="21"/>
+          <w:lang w:val="en-US"/>
+        </w:rPr>
+        <w:t>Selected work</w:t>
+      </w:r>
+    </w:p>
+    <w:p>
+      <w:pPr>
+        <w:keepNext/>
+        <w:keepLines/>
+        <w:widowControl/>
+        <w:spacing w:before="0" w:after="40" w:line="280" w:lineRule="exact"/>
+      </w:pPr>
+      <w:r>
+        <w:rPr>
+          <w:rFonts w:ascii="Segoe UI" w:hAnsi="Segoe UI"/>
+          <w:b/>
+          <w:color w:val="292925"/>
+          <w:sz w:val="21"/>
+          <w:lang w:val="en-US"/>
+        </w:rPr>
+        <w:t>Studio website - server-side integrations | 2026</w:t>
+      </w:r>
+    </w:p>
+    <w:p>
+      <w:pPr>
+        <w:keepNext w:val="0"/>
+        <w:keepLines/>
+        <w:widowControl/>
+        <w:spacing w:before="0" w:after="40" w:line="270" w:lineRule="exact"/>
+      </w:pPr>
+      <w:r>
+        <w:rPr>
+          <w:rFonts w:ascii="Segoe UI" w:hAnsi="Segoe UI"/>
+          <w:b w:val="0"/>
+          <w:color w:val="292925"/>
+          <w:sz w:val="20"/>
+          <w:lang w:val="en-US"/>
+        </w:rPr>
+        <w:t>A live service website. DIKIDI handles bookings; the site fetches and validates prices from an external source.</w:t>
+      </w:r>
+    </w:p>
+    <w:p>
+      <w:pPr>
+        <w:keepNext w:val="0"/>
+        <w:keepLines/>
+        <w:widowControl/>
+        <w:tabs>
+          <w:tab w:pos="240" w:val="left"/>
+        </w:tabs>
+        <w:spacing w:before="0" w:after="50" w:line="270" w:lineRule="exact"/>
+        <w:ind w:left="240" w:hanging="200"/>
+        <w:numPr>
+          <w:ilvl w:val="0"/>
+          <w:numId w:val="10"/>
+        </w:numPr>
+      </w:pPr>
+      <w:r>
+        <w:rPr>
+          <w:rFonts w:ascii="Segoe UI" w:hAnsi="Segoe UI"/>
+          <w:b w:val="0"/>
+          <w:color w:val="292925"/>
+          <w:sz w:val="20"/>
+          <w:lang w:val="en-US"/>
+        </w:rPr>
+        <w:t>Refreshed prices every five minutes. On an error or partial response, the site retains the last verified version and marks it stale.</w:t>
+      </w:r>
+    </w:p>
+    <w:p>
+      <w:pPr>
+        <w:keepNext w:val="0"/>
+        <w:keepLines/>
+        <w:widowControl/>
+        <w:tabs>
+          <w:tab w:pos="240" w:val="left"/>
+        </w:tabs>
+        <w:spacing w:before="0" w:after="50" w:line="270" w:lineRule="exact"/>
+        <w:ind w:left="240" w:hanging="200"/>
+        <w:numPr>
+          <w:ilvl w:val="0"/>
+          <w:numId w:val="10"/>
+        </w:numPr>
+      </w:pPr>
+      <w:r>
+        <w:rPr>
+          <w:rFonts w:ascii="Segoe UI" w:hAnsi="Segoe UI"/>
+          <w:b w:val="0"/>
+          <w:color w:val="292925"/>
+          <w:sz w:val="20"/>
+          <w:lang w:val="en-US"/>
+        </w:rPr>
+        <w:t>Synchronized PDFs without deleting the prior copy on failure. Tests cover concurrent requests, invalid data, source failures and restart recovery.</w:t>
+      </w:r>
+    </w:p>
+    <w:p>
+      <w:pPr>
+        <w:keepNext/>
+        <w:keepLines/>
+        <w:widowControl/>
+        <w:spacing w:before="0" w:after="40" w:line="280" w:lineRule="exact"/>
+      </w:pPr>
+      <w:r>
+        <w:rPr>
+          <w:rFonts w:ascii="Segoe UI" w:hAnsi="Segoe UI"/>
+          <w:b/>
+          <w:color w:val="292925"/>
+          <w:sz w:val="21"/>
+          <w:lang w:val="en-US"/>
+        </w:rPr>
+        <w:t>Event processing and external APIs | 2026</w:t>
+      </w:r>
+    </w:p>
+    <w:p>
+      <w:pPr>
+        <w:keepNext w:val="0"/>
+        <w:keepLines/>
+        <w:widowControl/>
+        <w:spacing w:before="0" w:after="40" w:line="270" w:lineRule="exact"/>
+      </w:pPr>
+      <w:r>
+        <w:rPr>
+          <w:rFonts w:ascii="Segoe UI" w:hAnsi="Segoe UI"/>
+          <w:b w:val="0"/>
+          <w:color w:val="292925"/>
+          <w:sz w:val="20"/>
+          <w:lang w:val="en-US"/>
+        </w:rPr>
+        <w:t>A tool for receiving external events and HTTP data with replay after an interruption.</w:t>
+      </w:r>
+    </w:p>
+    <w:p>
+      <w:pPr>
+        <w:keepNext w:val="0"/>
+        <w:keepLines/>
+        <w:widowControl/>
+        <w:tabs>
+          <w:tab w:pos="240" w:val="left"/>
+        </w:tabs>
+        <w:spacing w:before="0" w:after="50" w:line="270" w:lineRule="exact"/>
+        <w:ind w:left="240" w:hanging="200"/>
+        <w:numPr>
+          <w:ilvl w:val="0"/>
+          <w:numId w:val="10"/>
+        </w:numPr>
+      </w:pPr>
+      <w:r>
+        <w:rPr>
+          <w:rFonts w:ascii="Segoe UI" w:hAnsi="Segoe UI"/>
+          <w:b w:val="0"/>
+          <w:color w:val="292925"/>
+          <w:sz w:val="20"/>
+          <w:lang w:val="en-US"/>
+        </w:rPr>
+        <w:t>In Rust, I batched raw events into a segmented journal before decoding them; a bounded channel slows ingestion under load. Tests cover order and overflow.</w:t>
+      </w:r>
+    </w:p>
+    <w:p>
+      <w:pPr>
+        <w:keepNext w:val="0"/>
+        <w:keepLines/>
+        <w:widowControl/>
+        <w:tabs>
+          <w:tab w:pos="240" w:val="left"/>
+        </w:tabs>
+        <w:spacing w:before="0" w:after="50" w:line="270" w:lineRule="exact"/>
+        <w:ind w:left="240" w:hanging="200"/>
+        <w:numPr>
+          <w:ilvl w:val="0"/>
+          <w:numId w:val="10"/>
+        </w:numPr>
+      </w:pPr>
+      <w:r>
+        <w:rPr>
+          <w:rFonts w:ascii="Segoe UI" w:hAnsi="Segoe UI"/>
+          <w:b w:val="0"/>
+          <w:color w:val="292925"/>
+          <w:sz w:val="20"/>
+          <w:lang w:val="en-US"/>
+        </w:rPr>
+        <w:t>In the Python client, I handled 429/Retry-After, per-source cooldowns and deferred work that survives restarts. Tests verify that sources remain independent.</w:t>
+      </w:r>
+    </w:p>
+    <w:p>
+      <w:pPr>
+        <w:keepNext/>
+        <w:keepLines/>
+        <w:widowControl/>
+        <w:spacing w:before="0" w:after="40" w:line="280" w:lineRule="exact"/>
+      </w:pPr>
+      <w:r>
+        <w:rPr>
+          <w:rFonts w:ascii="Segoe UI" w:hAnsi="Segoe UI"/>
+          <w:b/>
+          <w:color w:val="292925"/>
+          <w:sz w:val="21"/>
+          <w:lang w:val="en-US"/>
+        </w:rPr>
+        <w:t>Antiplag - diploma project | 2026</w:t>
+      </w:r>
+    </w:p>
+    <w:p>
+      <w:pPr>
+        <w:keepNext w:val="0"/>
+        <w:keepLines/>
+        <w:widowControl/>
+        <w:spacing w:before="0" w:after="40" w:line="270" w:lineRule="exact"/>
+      </w:pPr>
+      <w:r>
+        <w:rPr>
+          <w:rFonts w:ascii="Segoe UI" w:hAnsi="Segoe UI"/>
+          <w:b w:val="0"/>
+          <w:color w:val="292925"/>
+          <w:sz w:val="20"/>
+          <w:lang w:val="en-US"/>
+        </w:rPr>
+        <w:t>A diploma prototype for coursework documents and groups; the originality-checking algorithm is not implemented.</w:t>
+      </w:r>
+    </w:p>
+    <w:p>
+      <w:pPr>
+        <w:keepNext w:val="0"/>
+        <w:keepLines/>
+        <w:widowControl/>
+        <w:tabs>
+          <w:tab w:pos="240" w:val="left"/>
+        </w:tabs>
+        <w:spacing w:before="0" w:after="50" w:line="270" w:lineRule="exact"/>
+        <w:ind w:left="240" w:hanging="200"/>
+        <w:numPr>
+          <w:ilvl w:val="0"/>
+          <w:numId w:val="10"/>
+        </w:numPr>
+      </w:pPr>
+      <w:r>
+        <w:rPr>
+          <w:rFonts w:ascii="Segoe UI" w:hAnsi="Segoe UI"/>
+          <w:b w:val="0"/>
+          <w:color w:val="292925"/>
+          <w:sz w:val="20"/>
+          <w:lang w:val="en-US"/>
+        </w:rPr>
+        <w:t>Built Bun/Hono uploads for PDF, DOC, DOCX and TXT with type and size checks, PostgreSQL metadata, and document routes with role and owner checks.</w:t>
+      </w:r>
+    </w:p>
+    <w:p>
+      <w:pPr>
+        <w:keepNext w:val="0"/>
+        <w:keepLines/>
+        <w:widowControl/>
+        <w:tabs>
+          <w:tab w:pos="240" w:val="left"/>
+        </w:tabs>
+        <w:spacing w:before="0" w:after="50" w:line="270" w:lineRule="exact"/>
+        <w:ind w:left="240" w:hanging="200"/>
+        <w:numPr>
+          <w:ilvl w:val="0"/>
+          <w:numId w:val="10"/>
+        </w:numPr>
+      </w:pPr>
+      <w:r>
+        <w:rPr>
+          <w:rFonts w:ascii="Segoe UI" w:hAnsi="Segoe UI"/>
+          <w:b w:val="0"/>
+          <w:color w:val="292925"/>
+          <w:sz w:val="20"/>
+          <w:lang w:val="en-US"/>
+        </w:rPr>
+        <w:t>Separated authentication, documents and groups into modules, implemented refresh-token rotation and connected the API to a React UI.</w:t>
+      </w:r>
+    </w:p>
+    <w:p>
+      <w:pPr>
+        <w:keepNext/>
+        <w:keepLines/>
+        <w:widowControl/>
+        <w:spacing w:before="0" w:after="40" w:line="280" w:lineRule="exact"/>
+      </w:pPr>
+      <w:r>
+        <w:rPr>
+          <w:rFonts w:ascii="Segoe UI" w:hAnsi="Segoe UI"/>
+          <w:b/>
+          <w:color w:val="292925"/>
+          <w:sz w:val="21"/>
+          <w:lang w:val="en-US"/>
+        </w:rPr>
+        <w:t>WindowsTweaker - system utility | 2026</w:t>
+      </w:r>
+    </w:p>
+    <w:p>
+      <w:pPr>
+        <w:keepNext w:val="0"/>
+        <w:keepLines/>
+        <w:widowControl/>
+        <w:spacing w:before="0" w:after="40" w:line="270" w:lineRule="exact"/>
+      </w:pPr>
+      <w:r>
+        <w:rPr>
+          <w:rFonts w:ascii="Segoe UI" w:hAnsi="Segoe UI"/>
+          <w:b w:val="0"/>
+          <w:color w:val="292925"/>
+          <w:sz w:val="20"/>
+          <w:lang w:val="en-US"/>
+        </w:rPr>
+        <w:t>A personal C#/.NET 10 and WPF utility for diagnosing Windows settings.</w:t>
+      </w:r>
+    </w:p>
+    <w:p>
+      <w:pPr>
+        <w:keepNext w:val="0"/>
+        <w:keepLines/>
+        <w:widowControl/>
+        <w:tabs>
+          <w:tab w:pos="240" w:val="left"/>
+        </w:tabs>
+        <w:spacing w:before="0" w:after="50" w:line="270" w:lineRule="exact"/>
+        <w:ind w:left="240" w:hanging="200"/>
+        <w:numPr>
+          <w:ilvl w:val="0"/>
+          <w:numId w:val="10"/>
+        </w:numPr>
+      </w:pPr>
+      <w:r>
+        <w:rPr>
+          <w:rFonts w:ascii="Segoe UI" w:hAnsi="Segoe UI"/>
+          <w:b w:val="0"/>
+          <w:color w:val="292925"/>
+          <w:sz w:val="20"/>
+          <w:lang w:val="en-US"/>
+        </w:rPr>
+        <w:t>Built a no-write plan that checks applicability to the Windows edition and build and shows unknown states explicitly. Separately developed and tested a journaled apply, verify and restore engine; the UI remains diagnostic.</w:t>
+      </w:r>
+    </w:p>
+    <w:p>
+      <w:pPr>
+        <w:pStyle w:val="Heading1"/>
+        <w:keepNext/>
+        <w:keepLines/>
+        <w:widowControl/>
+        <w:spacing w:before="180" w:after="80" w:line="280" w:lineRule="exact"/>
+      </w:pPr>
+      <w:r>
+        <w:rPr>
+          <w:rFonts w:ascii="Segoe UI" w:hAnsi="Segoe UI"/>
+          <w:b/>
+          <w:color w:val="B74B34"/>
+          <w:sz w:val="21"/>
           <w:lang w:val="en-US"/>
         </w:rPr>
         <w:t>Skills</w:t>
@@ -199,27 +544,27 @@
         <w:keepNext w:val="0"/>
         <w:keepLines/>
         <w:widowControl/>
-        <w:spacing w:before="0" w:after="80" w:line="272" w:lineRule="exact"/>
+        <w:spacing w:before="0" w:after="40" w:line="270" w:lineRule="exact"/>
       </w:pPr>
       <w:r>
         <w:rPr>
-          <w:rFonts w:ascii="Arial" w:hAnsi="Arial"/>
+          <w:rFonts w:ascii="Segoe UI" w:hAnsi="Segoe UI"/>
           <w:b/>
-          <w:color w:val="000000"/>
+          <w:color w:val="292925"/>
           <w:sz w:val="20"/>
           <w:lang w:val="en-US"/>
         </w:rPr>
-        <w:t>Main stack:</w:t>
+        <w:t>Backend and data:</w:t>
       </w:r>
       <w:r>
         <w:rPr>
-          <w:rFonts w:ascii="Arial" w:hAnsi="Arial"/>
+          <w:rFonts w:ascii="Segoe UI" w:hAnsi="Segoe UI"/>
           <w:b w:val="0"/>
-          <w:color w:val="000000"/>
+          <w:color w:val="292925"/>
           <w:sz w:val="20"/>
           <w:lang w:val="en-US"/>
         </w:rPr>
-        <w:t xml:space="preserve"> Python, Django, Django REST Framework, TypeScript, Node.js, PostgreSQL, SQL.</w:t>
+        <w:t xml:space="preserve"> TypeScript, Bun/Hono, Node.js, Python, PostgreSQL, SQL, HTTP APIs.</w:t>
       </w:r>
     </w:p>
     <w:p>
@@ -227,27 +572,27 @@
         <w:keepNext w:val="0"/>
         <w:keepLines/>
         <w:widowControl/>
-        <w:spacing w:before="0" w:after="80" w:line="272" w:lineRule="exact"/>
+        <w:spacing w:before="0" w:after="40" w:line="270" w:lineRule="exact"/>
       </w:pPr>
       <w:r>
         <w:rPr>
-          <w:rFonts w:ascii="Arial" w:hAnsi="Arial"/>
+          <w:rFonts w:ascii="Segoe UI" w:hAnsi="Segoe UI"/>
           <w:b/>
-          <w:color w:val="000000"/>
+          <w:color w:val="292925"/>
           <w:sz w:val="20"/>
           <w:lang w:val="en-US"/>
         </w:rPr>
-        <w:t>Deployment tools:</w:t>
+        <w:t>Systems:</w:t>
       </w:r>
       <w:r>
         <w:rPr>
-          <w:rFonts w:ascii="Arial" w:hAnsi="Arial"/>
+          <w:rFonts w:ascii="Segoe UI" w:hAnsi="Segoe UI"/>
           <w:b w:val="0"/>
-          <w:color w:val="000000"/>
+          <w:color w:val="292925"/>
           <w:sz w:val="20"/>
           <w:lang w:val="en-US"/>
         </w:rPr>
-        <w:t xml:space="preserve"> Docker, Docker Compose, Nginx, Git.</w:t>
+        <w:t xml:space="preserve"> Rust, C#/.NET, WPF, file journals and diagnostics.</w:t>
       </w:r>
     </w:p>
     <w:p>
@@ -255,17 +600,27 @@
         <w:keepNext w:val="0"/>
         <w:keepLines/>
         <w:widowControl/>
-        <w:spacing w:before="0" w:after="80" w:line="272" w:lineRule="exact"/>
+        <w:spacing w:before="0" w:after="40" w:line="270" w:lineRule="exact"/>
       </w:pPr>
       <w:r>
         <w:rPr>
-          <w:rFonts w:ascii="Arial" w:hAnsi="Arial"/>
-          <w:b w:val="0"/>
-          <w:color w:val="000000"/>
+          <w:rFonts w:ascii="Segoe UI" w:hAnsi="Segoe UI"/>
+          <w:b/>
+          <w:color w:val="292925"/>
           <w:sz w:val="20"/>
           <w:lang w:val="en-US"/>
         </w:rPr>
-        <w:t>Also worked with Go, C#, React, Next.js and Socket.io.</w:t>
+        <w:t>Testing and delivery:</w:t>
+      </w:r>
+      <w:r>
+        <w:rPr>
+          <w:rFonts w:ascii="Segoe UI" w:hAnsi="Segoe UI"/>
+          <w:b w:val="0"/>
+          <w:color w:val="292925"/>
+          <w:sz w:val="20"/>
+          <w:lang w:val="en-US"/>
+        </w:rPr>
+        <w:t xml:space="preserve"> automated tests, GitHub Actions, Docker Compose, Git.</w:t>
       </w:r>
     </w:p>
     <w:p>
@@ -274,249 +629,14 @@
         <w:keepNext/>
         <w:keepLines/>
         <w:widowControl/>
-        <w:spacing w:before="260" w:after="100" w:line="280" w:lineRule="exact"/>
+        <w:spacing w:before="180" w:after="80" w:line="280" w:lineRule="exact"/>
       </w:pPr>
       <w:r>
         <w:rPr>
-          <w:rFonts w:ascii="Arial" w:hAnsi="Arial"/>
+          <w:rFonts w:ascii="Segoe UI" w:hAnsi="Segoe UI"/>
           <w:b/>
-          <w:color w:val="000000"/>
-          <w:sz w:val="22"/>
-          <w:lang w:val="en-US"/>
-        </w:rPr>
-        <w:t>Project experience</w:t>
-      </w:r>
-    </w:p>
-    <w:p>
-      <w:pPr>
-        <w:keepNext w:val="0"/>
-        <w:keepLines/>
-        <w:widowControl/>
-        <w:tabs>
-          <w:tab w:pos="240" w:val="left"/>
-        </w:tabs>
-        <w:spacing w:before="0" w:after="100" w:line="272" w:lineRule="exact"/>
-        <w:ind w:left="240" w:hanging="200"/>
-        <w:numPr>
-          <w:ilvl w:val="0"/>
-          <w:numId w:val="10"/>
-        </w:numPr>
-      </w:pPr>
-      <w:r>
-        <w:rPr>
-          <w:rFonts w:ascii="Arial" w:hAnsi="Arial"/>
-          <w:b/>
-          <w:color w:val="000000"/>
-          <w:sz w:val="20"/>
-          <w:lang w:val="en-US"/>
-        </w:rPr>
-        <w:t>APIs and access:</w:t>
-      </w:r>
-      <w:r>
-        <w:rPr>
-          <w:rFonts w:ascii="Arial" w:hAnsi="Arial"/>
-          <w:b w:val="0"/>
-          <w:color w:val="000000"/>
-          <w:sz w:val="20"/>
-          <w:lang w:val="en-US"/>
-        </w:rPr>
-        <w:t xml:space="preserve"> built registration, authentication, user accounts and admin panels. Set up role-based permissions and JWT token refresh.</w:t>
-      </w:r>
-    </w:p>
-    <w:p>
-      <w:pPr>
-        <w:keepNext w:val="0"/>
-        <w:keepLines/>
-        <w:widowControl/>
-        <w:tabs>
-          <w:tab w:pos="240" w:val="left"/>
-        </w:tabs>
-        <w:spacing w:before="0" w:after="100" w:line="272" w:lineRule="exact"/>
-        <w:ind w:left="240" w:hanging="200"/>
-        <w:numPr>
-          <w:ilvl w:val="0"/>
-          <w:numId w:val="10"/>
-        </w:numPr>
-      </w:pPr>
-      <w:r>
-        <w:rPr>
-          <w:rFonts w:ascii="Arial" w:hAnsi="Arial"/>
-          <w:b/>
-          <w:color w:val="000000"/>
-          <w:sz w:val="20"/>
-          <w:lang w:val="en-US"/>
-        </w:rPr>
-        <w:t>Databases:</w:t>
-      </w:r>
-      <w:r>
-        <w:rPr>
-          <w:rFonts w:ascii="Arial" w:hAnsi="Arial"/>
-          <w:b w:val="0"/>
-          <w:color w:val="000000"/>
-          <w:sz w:val="20"/>
-          <w:lang w:val="en-US"/>
-        </w:rPr>
-        <w:t xml:space="preserve"> designed PostgreSQL tables and relationships. Wrote search and filter queries, and SQL functions for pricing and commission calculations. Added sales and stock tracking to a store management application.</w:t>
-      </w:r>
-    </w:p>
-    <w:p>
-      <w:pPr>
-        <w:keepNext w:val="0"/>
-        <w:keepLines/>
-        <w:widowControl/>
-        <w:tabs>
-          <w:tab w:pos="240" w:val="left"/>
-        </w:tabs>
-        <w:spacing w:before="0" w:after="100" w:line="272" w:lineRule="exact"/>
-        <w:ind w:left="240" w:hanging="200"/>
-        <w:numPr>
-          <w:ilvl w:val="0"/>
-          <w:numId w:val="10"/>
-        </w:numPr>
-      </w:pPr>
-      <w:r>
-        <w:rPr>
-          <w:rFonts w:ascii="Arial" w:hAnsi="Arial"/>
-          <w:b/>
-          <w:color w:val="000000"/>
-          <w:sz w:val="20"/>
-          <w:lang w:val="en-US"/>
-        </w:rPr>
-        <w:t>Documents:</w:t>
-      </w:r>
-      <w:r>
-        <w:rPr>
-          <w:rFonts w:ascii="Arial" w:hAnsi="Arial"/>
-          <w:b w:val="0"/>
-          <w:color w:val="000000"/>
-          <w:sz w:val="20"/>
-          <w:lang w:val="en-US"/>
-        </w:rPr>
-        <w:t xml:space="preserve"> built file uploads and metadata storage. Linked documents to users and groups, and added API endpoints for managing records.</w:t>
-      </w:r>
-    </w:p>
-    <w:p>
-      <w:pPr>
-        <w:keepNext w:val="0"/>
-        <w:keepLines/>
-        <w:widowControl/>
-        <w:tabs>
-          <w:tab w:pos="240" w:val="left"/>
-        </w:tabs>
-        <w:spacing w:before="0" w:after="100" w:line="272" w:lineRule="exact"/>
-        <w:ind w:left="240" w:hanging="200"/>
-        <w:numPr>
-          <w:ilvl w:val="0"/>
-          <w:numId w:val="10"/>
-        </w:numPr>
-      </w:pPr>
-      <w:r>
-        <w:rPr>
-          <w:rFonts w:ascii="Arial" w:hAnsi="Arial"/>
-          <w:b/>
-          <w:color w:val="000000"/>
-          <w:sz w:val="20"/>
-          <w:lang w:val="en-US"/>
-        </w:rPr>
-        <w:t>Service booking:</w:t>
-      </w:r>
-      <w:r>
-        <w:rPr>
-          <w:rFonts w:ascii="Arial" w:hAnsi="Arial"/>
-          <w:b w:val="0"/>
-          <w:color w:val="000000"/>
-          <w:sz w:val="20"/>
-          <w:lang w:val="en-US"/>
-        </w:rPr>
-        <w:t xml:space="preserve"> built schedules, staff and time selection, and booking statuses. Added an admin panel for managing services, clients and bookings.</w:t>
-      </w:r>
-    </w:p>
-    <w:p>
-      <w:pPr>
-        <w:keepNext w:val="0"/>
-        <w:keepLines/>
-        <w:widowControl/>
-        <w:tabs>
-          <w:tab w:pos="240" w:val="left"/>
-        </w:tabs>
-        <w:spacing w:before="0" w:after="100" w:line="272" w:lineRule="exact"/>
-        <w:ind w:left="240" w:hanging="200"/>
-        <w:numPr>
-          <w:ilvl w:val="0"/>
-          <w:numId w:val="10"/>
-        </w:numPr>
-      </w:pPr>
-      <w:r>
-        <w:rPr>
-          <w:rFonts w:ascii="Arial" w:hAnsi="Arial"/>
-          <w:b/>
-          <w:color w:val="000000"/>
-          <w:sz w:val="20"/>
-          <w:lang w:val="en-US"/>
-        </w:rPr>
-        <w:t>Bots and integrations:</w:t>
-      </w:r>
-      <w:r>
-        <w:rPr>
-          <w:rFonts w:ascii="Arial" w:hAnsi="Arial"/>
-          <w:b w:val="0"/>
-          <w:color w:val="000000"/>
-          <w:sz w:val="20"/>
-          <w:lang w:val="en-US"/>
-        </w:rPr>
-        <w:t xml:space="preserve"> wrote Telegram bots in Python and Go, command handlers and automated replies. Connected external APIs, and set up notifications and messaging through Socket.io.</w:t>
-      </w:r>
-    </w:p>
-    <w:p>
-      <w:pPr>
-        <w:keepNext w:val="0"/>
-        <w:keepLines/>
-        <w:widowControl/>
-        <w:tabs>
-          <w:tab w:pos="240" w:val="left"/>
-        </w:tabs>
-        <w:spacing w:before="0" w:after="100" w:line="272" w:lineRule="exact"/>
-        <w:ind w:left="240" w:hanging="200"/>
-        <w:numPr>
-          <w:ilvl w:val="0"/>
-          <w:numId w:val="10"/>
-        </w:numPr>
-      </w:pPr>
-      <w:r>
-        <w:rPr>
-          <w:rFonts w:ascii="Arial" w:hAnsi="Arial"/>
-          <w:b/>
-          <w:color w:val="000000"/>
-          <w:sz w:val="20"/>
-          <w:lang w:val="en-US"/>
-        </w:rPr>
-        <w:t>Deployment and maintenance:</w:t>
-      </w:r>
-      <w:r>
-        <w:rPr>
-          <w:rFonts w:ascii="Arial" w:hAnsi="Arial"/>
-          <w:b w:val="0"/>
-          <w:color w:val="000000"/>
-          <w:sz w:val="20"/>
-          <w:lang w:val="en-US"/>
-        </w:rPr>
-        <w:t xml:space="preserve"> prepared applications for launch with Docker and Nginx. Maintained small-business websites, fixed forms and page layouts across screen sizes.</w:t>
-      </w:r>
-    </w:p>
-    <w:p>
-      <w:pPr>
-        <w:pStyle w:val="Heading1"/>
-        <w:keepNext/>
-        <w:keepLines/>
-        <w:widowControl/>
-        <w:spacing w:before="260" w:after="100" w:line="280" w:lineRule="exact"/>
-      </w:pPr>
-      <w:r>
-        <w:rPr>
-          <w:rFonts w:ascii="Arial" w:hAnsi="Arial"/>
-          <w:b/>
-          <w:color w:val="000000"/>
-          <w:sz w:val="22"/>
+          <w:color w:val="B74B34"/>
+          <w:sz w:val="21"/>
           <w:lang w:val="en-US"/>
         </w:rPr>
         <w:t>Education</w:t>
@@ -527,59 +647,22 @@
         <w:keepNext w:val="0"/>
         <w:keepLines/>
         <w:widowControl/>
-        <w:spacing w:before="0" w:after="80" w:line="272" w:lineRule="exact"/>
+        <w:spacing w:before="0" w:after="40" w:line="270" w:lineRule="exact"/>
       </w:pPr>
       <w:r>
         <w:rPr>
-          <w:rFonts w:ascii="Arial" w:hAnsi="Arial"/>
+          <w:rFonts w:ascii="Segoe UI" w:hAnsi="Segoe UI"/>
           <w:b w:val="0"/>
-          <w:color w:val="000000"/>
+          <w:color w:val="292925"/>
           <w:sz w:val="20"/>
           <w:lang w:val="en-US"/>
         </w:rPr>
         <w:t>Peter the Great St. Petersburg Polytechnic University, 2026. Secondary vocational education in Information Systems and Programming.</w:t>
       </w:r>
     </w:p>
-    <w:p>
-      <w:pPr>
-        <w:pStyle w:val="Heading1"/>
-        <w:keepNext/>
-        <w:keepLines/>
-        <w:widowControl/>
-        <w:spacing w:before="260" w:after="100" w:line="280" w:lineRule="exact"/>
-      </w:pPr>
-      <w:r>
-        <w:rPr>
-          <w:rFonts w:ascii="Arial" w:hAnsi="Arial"/>
-          <w:b/>
-          <w:color w:val="000000"/>
-          <w:sz w:val="22"/>
-          <w:lang w:val="en-US"/>
-        </w:rPr>
-        <w:t>Languages</w:t>
-      </w:r>
-    </w:p>
-    <w:p>
-      <w:pPr>
-        <w:keepNext w:val="0"/>
-        <w:keepLines/>
-        <w:widowControl/>
-        <w:spacing w:before="0" w:after="80" w:line="272" w:lineRule="exact"/>
-      </w:pPr>
-      <w:r>
-        <w:rPr>
-          <w:rFonts w:ascii="Arial" w:hAnsi="Arial"/>
-          <w:b w:val="0"/>
-          <w:color w:val="000000"/>
-          <w:sz w:val="20"/>
-          <w:lang w:val="en-US"/>
-        </w:rPr>
-        <w:t>Russian - native.</w:t>
-      </w:r>
-    </w:p>
     <w:sectPr>
       <w:pgSz w:w="11906" w:h="16838"/>
-      <w:pgMar w:top="1020" w:right="1134" w:bottom="1020" w:left="1134" w:header="720" w:footer="720" w:gutter="0"/>
+      <w:pgMar w:top="935" w:right="1134" w:bottom="935" w:left="1134" w:header="720" w:footer="720" w:gutter="0"/>
       <w:cols w:space="720"/>
       <w:docGrid w:linePitch="360"/>
     </w:sectPr>
@@ -794,7 +877,7 @@
       <w:lvlText w:val="•"/>
       <w:lvlJc w:val="left"/>
       <w:rPr>
-        <w:rFonts w:ascii="Arial" w:hAnsi="Arial"/>
+        <w:rFonts w:ascii="Segoe UI" w:hAnsi="Segoe UI"/>
       </w:rPr>
     </w:lvl>
   </w:abstractNum>
@@ -965,9 +1048,9 @@
     <w:qFormat/>
     <w:rsid w:val="00FC693F"/>
     <w:rPr>
-      <w:rFonts w:ascii="Arial" w:hAnsi="Arial" w:eastAsia="Arial" w:cs="Arial"/>
+      <w:rFonts w:ascii="Segoe UI" w:hAnsi="Segoe UI" w:eastAsia="Segoe UI" w:cs="Segoe UI"/>
       <w:b w:val="0"/>
-      <w:color w:val="000000"/>
+      <w:color w:val="292925"/>
       <w:sz w:val="20"/>
     </w:rPr>
   </w:style>
@@ -1030,11 +1113,11 @@
       <w:outlineLvl w:val="0"/>
     </w:pPr>
     <w:rPr>
-      <w:rFonts w:cstheme="majorBidi" w:ascii="Arial" w:hAnsi="Arial" w:eastAsia="Arial" w:cs="Arial"/>
+      <w:rFonts w:cstheme="majorBidi" w:ascii="Segoe UI" w:hAnsi="Segoe UI" w:eastAsia="Segoe UI" w:cs="Segoe UI"/>
       <w:b/>
       <w:bCs/>
-      <w:color w:val="000000"/>
-      <w:sz w:val="22"/>
+      <w:color w:val="292925"/>
+      <w:sz w:val="21"/>
       <w:szCs w:val="28"/>
     </w:rPr>
   </w:style>
@@ -1316,12 +1399,12 @@
       <w:contextualSpacing/>
     </w:pPr>
     <w:rPr>
-      <w:rFonts w:cstheme="majorBidi" w:ascii="Arial" w:hAnsi="Arial" w:eastAsia="Arial" w:cs="Arial"/>
+      <w:rFonts w:cstheme="majorBidi" w:ascii="Segoe UI" w:hAnsi="Segoe UI" w:eastAsia="Segoe UI" w:cs="Segoe UI"/>
       <w:b/>
-      <w:color w:val="000000"/>
+      <w:color w:val="292925"/>
       <w:spacing w:val="5"/>
       <w:kern w:val="28"/>
-      <w:sz w:val="48"/>
+      <w:sz w:val="54"/>
       <w:szCs w:val="52"/>
     </w:rPr>
   </w:style>

</xml_diff>